<commit_message>
Ajusta tesis y cuadro a los comentarios del profesor guía
- Sec. 4.4.3: frase pedida para los puntos 1 y 2 ("el PI incremental
  utilizado es uno de los controladores más usados en robótica móvil")
  y atribuciones de cada referencia ajustadas a lo que dicen las fuentes.
- Sec. 4.4.3 y Anexo 4.12: la estabilidad del PI incremental sigue las
  condiciones del PI clásico de las fuentes citadas (punto 3).
- Sec. 5.2: objetivo del trabajo y PSO como complemento (punto 6).
- Alcances y Sec. 5.6: ampliar ensayos como trabajo futuro y criterio
  de 6 a 10 repeticiones con varianza admisible (punto 8).
- Nombre PI incremental en figura 3.x, título de la Sec. 3.7 y anexos.
- Cuadro: textos de los puntos 1, 2, 3, 4, 6, 7 y 8 y páginas
  corregidas según el PDF compilado en Overleaf.

Co-Authored-By: Claude Opus 5.5 <noreply@anthropic.com>
Claude-Session: https://claude.ai/code/session_01EWeCh4nC8h4gsNaN6ikzEU
</commit_message>
<xml_diff>
--- a/Cuadro_observaciones_comision.docx
+++ b/Cuadro_observaciones_comision.docx
@@ -292,16 +292,15 @@
                 <w:sz w:val="20"/>
                 <w:szCs w:val="20"/>
               </w:rPr>
-              <w:t xml:space="preserve">La tesis explica qué hace realmente cada ganancia en la ley de control, que es la regla con que el controlador calcula la potencia. La llamada proporcional actúa como integral, la llamada derivativa como proporcional y la llamada integral agrega una segunda acumulación del error. Sin esa segunda acumulación, la ley coincide con el PI incremental descrito por Åström y Hägglund, un controlador que en cada ciclo calcula cuánto cambiar la potencia. Esta ley viene del </w:t>
+              <w:t xml:space="preserve">La tesis explica qué hace realmente cada ganancia en la ley de control, que es la regla con que el controlador calcula la potencia. La llamada proporcional actúa como integral, la llamada derivativa como proporcional y la llamada integral agrega una segunda acumulación del error. Sin esa segunda acumulación, la ley coincide con el PI incremental descrito por Åström y Hägglund (2006/2009, Sec. 13.4), un controlador que en cada ciclo calcula cuánto cambiar la potencia. El PI incremental utilizado es uno de los controladores más usados en robótica móvil (Raj y Kos, 2024, Bitriá y Palacín, 2022, Mori et al., 2024). Esta ley viene del </w:t>
             </w:r>
             <w:r>
               <w:rPr>
                 <w:i/>
-                <w:iCs/>
-                <w:sz w:val="20"/>
-                <w:szCs w:val="20"/>
-              </w:rPr>
-              <w:t>firmware</w:t>
+                <w:sz w:val="20"/>
+                <w:szCs w:val="20"/>
+              </w:rPr>
+              <w:t xml:space="preserve">firmware</w:t>
             </w:r>
             <w:r>
               <w:rPr>
@@ -331,40 +330,39 @@
                 <w:sz w:val="20"/>
                 <w:szCs w:val="20"/>
               </w:rPr>
-              <w:t>Sección 4.4.3, p. 47 a 49: qué hace realmente cada ganancia.</w:t>
-            </w:r>
-          </w:p>
-          <w:p>
-            <w:pPr>
-              <w:spacing w:after="60" w:line="245" w:lineRule="auto"/>
-            </w:pPr>
-            <w:r>
-              <w:rPr>
-                <w:sz w:val="20"/>
-                <w:szCs w:val="20"/>
-              </w:rPr>
-              <w:t>Tabla 4.4, p. 49: valores equivalentes del PI incremental.</w:t>
-            </w:r>
-          </w:p>
-          <w:p>
-            <w:pPr>
-              <w:spacing w:line="245" w:lineRule="auto"/>
-            </w:pPr>
-            <w:r>
-              <w:rPr>
-                <w:sz w:val="20"/>
-                <w:szCs w:val="20"/>
-              </w:rPr>
-              <w:t xml:space="preserve">Anexo 4.5, p. 113: origen de la ley en el </w:t>
+              <w:t xml:space="preserve">Sección 4.4.3, p. 47 a 49: qué hace realmente cada ganancia y uso del PI incremental en robótica móvil.</w:t>
+            </w:r>
+          </w:p>
+          <w:p>
+            <w:pPr>
+              <w:spacing w:after="60" w:line="245" w:lineRule="auto"/>
+            </w:pPr>
+            <w:r>
+              <w:rPr>
+                <w:sz w:val="20"/>
+                <w:szCs w:val="20"/>
+              </w:rPr>
+              <w:t xml:space="preserve">Tabla 4.4, p. 50: valores equivalentes del PI incremental.</w:t>
+            </w:r>
+          </w:p>
+          <w:p>
+            <w:pPr>
+              <w:spacing w:after="60" w:line="245" w:lineRule="auto"/>
+            </w:pPr>
+            <w:r>
+              <w:rPr>
+                <w:sz w:val="20"/>
+                <w:szCs w:val="20"/>
+              </w:rPr>
+              <w:t xml:space="preserve">Anexo 4.5, p. 117: origen de la ley en el </w:t>
             </w:r>
             <w:r>
               <w:rPr>
                 <w:i/>
-                <w:iCs/>
-                <w:sz w:val="20"/>
-                <w:szCs w:val="20"/>
-              </w:rPr>
-              <w:t>firmware</w:t>
+                <w:sz w:val="20"/>
+                <w:szCs w:val="20"/>
+              </w:rPr>
+              <w:t xml:space="preserve">firmware</w:t>
             </w:r>
             <w:r>
               <w:rPr>
@@ -441,44 +439,29 @@
             <w:pPr>
               <w:spacing w:line="245" w:lineRule="auto"/>
             </w:pPr>
-            <w:r>
-              <w:rPr>
-                <w:sz w:val="20"/>
-                <w:szCs w:val="20"/>
-              </w:rPr>
-              <w:t xml:space="preserve">La tesis entrega dos razones. La primera es la compatibilidad. La interfaz que conecta el Arduino con ROS 2, el conjunto de programas que coordina el </w:t>
-            </w:r>
             <w:proofErr w:type="gramStart"/>
-            <w:r>
-              <w:rPr>
-                <w:sz w:val="20"/>
-                <w:szCs w:val="20"/>
-              </w:rPr>
-              <w:t>robot,</w:t>
-            </w:r>
             <w:proofErr w:type="gramEnd"/>
             <w:r>
               <w:rPr>
                 <w:sz w:val="20"/>
                 <w:szCs w:val="20"/>
               </w:rPr>
-              <w:t xml:space="preserve"> usa el protocolo de este </w:t>
+              <w:t xml:space="preserve">La tesis entrega tres razones. La primera es que el PI incremental utilizado es uno de los controladores más usados en robótica móvil (fila 1) y su forma incremental se usa desde los primeros controladores de motores (Åström y Hägglund, 2006/2009, Sec. 13.4). La segunda es la compatibilidad. La interfaz que conecta el Arduino con ROS 2, el conjunto de programas que coordina el robot, usa el protocolo de este </w:t>
             </w:r>
             <w:r>
               <w:rPr>
                 <w:i/>
-                <w:iCs/>
-                <w:sz w:val="20"/>
-                <w:szCs w:val="20"/>
-              </w:rPr>
-              <w:t>firmware</w:t>
-            </w:r>
-            <w:r>
-              <w:rPr>
-                <w:sz w:val="20"/>
-                <w:szCs w:val="20"/>
-              </w:rPr>
-              <w:t>. La segunda es que la forma incremental facilita que el controlador no siga acumulando error cuando el motor ya entrega su potencia máxima. Además, la ley sigue la velocidad pedida y es estable (fila 3). Compararla con otras leyes queda como trabajo futuro.</w:t>
+                <w:sz w:val="20"/>
+                <w:szCs w:val="20"/>
+              </w:rPr>
+              <w:t xml:space="preserve">firmware</w:t>
+            </w:r>
+            <w:r>
+              <w:rPr>
+                <w:sz w:val="20"/>
+                <w:szCs w:val="20"/>
+              </w:rPr>
+              <w:t xml:space="preserve">. La tercera es que la forma incremental facilita que el controlador no siga acumulando error cuando el motor ya entrega su potencia máxima (Åström y Hägglund, 2006/2009, Sec. 13.1 y 13.4, Sundström et al., 2024). Además, la ley sigue la velocidad pedida y es estable (fila 3). Compararla con otras leyes no forma parte de los objetivos y queda como trabajo futuro.</w:t>
             </w:r>
           </w:p>
         </w:tc>
@@ -501,19 +484,19 @@
                 <w:sz w:val="20"/>
                 <w:szCs w:val="20"/>
               </w:rPr>
-              <w:t>Sección 4.4.3, p. 49: razones para conservar la ley.</w:t>
-            </w:r>
-          </w:p>
-          <w:p>
-            <w:pPr>
-              <w:spacing w:line="245" w:lineRule="auto"/>
-            </w:pPr>
-            <w:r>
-              <w:rPr>
-                <w:sz w:val="20"/>
-                <w:szCs w:val="20"/>
-              </w:rPr>
-              <w:t>Trabajo futuro, punto 6, p. 83: comparación con otras leyes.</w:t>
+              <w:t xml:space="preserve">Sección 4.4.3, p. 49: razones para conservar la ley y sus referencias.</w:t>
+            </w:r>
+          </w:p>
+          <w:p>
+            <w:pPr>
+              <w:spacing w:after="60" w:line="245" w:lineRule="auto"/>
+            </w:pPr>
+            <w:r>
+              <w:rPr>
+                <w:sz w:val="20"/>
+                <w:szCs w:val="20"/>
+              </w:rPr>
+              <w:t xml:space="preserve">Trabajo futuro, punto 6, p. 84: comparación con otras leyes.</w:t>
             </w:r>
           </w:p>
         </w:tc>
@@ -589,21 +572,7 @@
                 <w:sz w:val="20"/>
                 <w:szCs w:val="20"/>
               </w:rPr>
-              <w:t xml:space="preserve">Se agrega un análisis de estabilidad del control de cada rueda. Como el retardo no se conoce con exactitud (fila 5), se revisan los dos extremos posibles, sin retardo y con una décima de segundo. En ambos el control es estable, y su sensibilidad máxima, un número que resume cuánto tolera que el motor real difiera del modelo, queda dentro de los valores que se consideran típicos. Solo dejaría de ser estable si el retardo superara unas cuatro décimas de segundo, más de cuatro veces ese extremo. </w:t>
-            </w:r>
-            <w:r>
-              <w:rPr>
-                <w:sz w:val="20"/>
-                <w:szCs w:val="20"/>
-              </w:rPr>
-              <w:t>También se calcula la estabilidad con 625 variantes del modelo del motor, que cambian cuánta velocidad entrega por cada nivel de potencia y qué tan rápido responde.</w:t>
-            </w:r>
-            <w:r>
-              <w:rPr>
-                <w:sz w:val="20"/>
-                <w:szCs w:val="20"/>
-              </w:rPr>
-              <w:t xml:space="preserve"> Sin retardo todas son estables. Con una décima de segundo, el control solo pierde la estabilidad si el motor entregara por cada nivel de potencia más de 4.4 veces la velocidad del motor real, o más de 2.8 veces en el caso más desfavorable de la rueda izquierda.</w:t>
+              <w:t xml:space="preserve">El PI incremental no es una ley nueva. Es una forma clásica del PID descrita por Åström y Hägglund (2006/2009, Sec. 13.4), citados en las filas 1 y 2, y sin saturación equivale al mismo PI en su forma habitual (Wittenmark et al., 2002, Sec. 8). Por eso su estabilidad viene dada por las condiciones ya establecidas para el PI clásico en esas fuentes. Como esas condiciones dependen del motor, la tesis las aplica al modelo de cada rueda. Como el retardo no se conoce con exactitud (fila 5), se revisan dos casos, sin retardo y con una décima de segundo, que no es una cota medida. En ambos el control es estable, y su sensibilidad máxima, un número que resume cuánto tolera que el motor real difiera del modelo, queda dentro de los valores que se consideran típicos (Wittenmark et al., 2002, Sec. 5). Solo dejaría de ser estable si el retardo superara unas cuatro décimas de segundo. También se revisan 625 variantes del modelo del motor, que cambian cuánta velocidad entrega por cada nivel de potencia y qué tan rápido responde. Sin retardo todas son estables. Con una décima de segundo, el control solo pierde la estabilidad si el motor entregara por cada nivel de potencia más de 4.4 veces la velocidad del motor real, o más de 2.8 veces en el caso más desfavorable de la rueda izquierda.</w:t>
             </w:r>
           </w:p>
         </w:tc>
@@ -626,19 +595,19 @@
                 <w:sz w:val="20"/>
                 <w:szCs w:val="20"/>
               </w:rPr>
-              <w:t>Sección 4.4.3, p. 50: resumen del análisis.</w:t>
-            </w:r>
-          </w:p>
-          <w:p>
-            <w:pPr>
-              <w:spacing w:line="245" w:lineRule="auto"/>
-            </w:pPr>
-            <w:r>
-              <w:rPr>
-                <w:sz w:val="20"/>
-                <w:szCs w:val="20"/>
-              </w:rPr>
-              <w:t>Anexo 4.12 y Tabla A4.5, p. 120 a 122: análisis completo y resultados.</w:t>
+              <w:t xml:space="preserve">Sección 4.4.3, p. 51: forma clásica del PI incremental y resumen del análisis.</w:t>
+            </w:r>
+          </w:p>
+          <w:p>
+            <w:pPr>
+              <w:spacing w:after="60" w:line="245" w:lineRule="auto"/>
+            </w:pPr>
+            <w:r>
+              <w:rPr>
+                <w:sz w:val="20"/>
+                <w:szCs w:val="20"/>
+              </w:rPr>
+              <w:t xml:space="preserve">Anexo 4.12 y Tabla A4.5, p. 124 a 127: análisis completo y resultados.</w:t>
             </w:r>
           </w:p>
         </w:tc>
@@ -713,21 +682,7 @@
                 <w:sz w:val="20"/>
                 <w:szCs w:val="20"/>
               </w:rPr>
-              <w:t>Se describen las condiciones reales de uso. A su velocidad máxima, cada rueda necesita cerca de 180 de los 255 niveles de potencia</w:t>
-            </w:r>
-            <w:r>
-              <w:rPr>
-                <w:sz w:val="20"/>
-                <w:szCs w:val="20"/>
-              </w:rPr>
-              <w:t xml:space="preserve"> (PWM)</w:t>
-            </w:r>
-            <w:r>
-              <w:rPr>
-                <w:sz w:val="20"/>
-                <w:szCs w:val="20"/>
-              </w:rPr>
-              <w:t>, así que el motor trabaja con margen. En el ensayo, hecho al límite de velocidad del robot, ambas ruedas alcanzan la velocidad pedida sin sobrepasarla de forma apreciable y con un error casi nulo. Las velocidades bajas, como al girar sobre su propio eje, no se evalúan y quedan como trabajo futuro.</w:t>
+              <w:t xml:space="preserve">El trabajo no tiene como objetivo comparar el desempeño de distintos controladores, sino verificar que el controlador usado cumple su función en el robot. Con ese fin se describen las condiciones reales de uso. A su velocidad máxima, cada rueda necesita cerca de 180 de los 255 niveles de potencia (PWM), así que el motor trabaja con margen. En el ensayo, hecho al límite de velocidad del robot, ambas ruedas alcanzan la velocidad pedida sin sobrepasarla de forma apreciable y con un error casi nulo, lo que es coherente con una ley en que la referencia solo entra en la acción integral (Åström y Hägglund, 2006/2009, Sec. 3.4). Las velocidades bajas, como al girar sobre su propio eje, no se evalúan y quedan como trabajo futuro, junto con la comparación con otras leyes.</w:t>
             </w:r>
           </w:p>
         </w:tc>
@@ -750,31 +705,31 @@
                 <w:sz w:val="20"/>
                 <w:szCs w:val="20"/>
               </w:rPr>
-              <w:t>Sección 5.2 y Tabla 5.3, p. 65 a 68: resultado del ensayo de velocidad.</w:t>
-            </w:r>
-          </w:p>
-          <w:p>
-            <w:pPr>
-              <w:spacing w:after="60" w:line="245" w:lineRule="auto"/>
-            </w:pPr>
-            <w:r>
-              <w:rPr>
-                <w:sz w:val="20"/>
-                <w:szCs w:val="20"/>
-              </w:rPr>
-              <w:t>Trabajo futuro, punto 6, p. 83: evaluación a velocidades bajas.</w:t>
-            </w:r>
-          </w:p>
-          <w:p>
-            <w:pPr>
-              <w:spacing w:line="245" w:lineRule="auto"/>
-            </w:pPr>
-            <w:r>
-              <w:rPr>
-                <w:sz w:val="20"/>
-                <w:szCs w:val="20"/>
-              </w:rPr>
-              <w:t>Anexo 4.12, p. 122: condiciones de operación y lo que el análisis no cubre.</w:t>
+              <w:t xml:space="preserve">Sección 5.2 y Tabla 5.3, p. 66 a 69: resultado del ensayo de velocidad.</w:t>
+            </w:r>
+          </w:p>
+          <w:p>
+            <w:pPr>
+              <w:spacing w:after="60" w:line="245" w:lineRule="auto"/>
+            </w:pPr>
+            <w:r>
+              <w:rPr>
+                <w:sz w:val="20"/>
+                <w:szCs w:val="20"/>
+              </w:rPr>
+              <w:t xml:space="preserve">Trabajo futuro, punto 6, p. 84: evaluación a velocidades bajas.</w:t>
+            </w:r>
+          </w:p>
+          <w:p>
+            <w:pPr>
+              <w:spacing w:after="60" w:line="245" w:lineRule="auto"/>
+            </w:pPr>
+            <w:r>
+              <w:rPr>
+                <w:sz w:val="20"/>
+                <w:szCs w:val="20"/>
+              </w:rPr>
+              <w:t xml:space="preserve">Anexo 4.12, p. 126: condiciones de operación y lo que el análisis no cubre.</w:t>
             </w:r>
           </w:p>
         </w:tc>
@@ -872,43 +827,43 @@
                 <w:sz w:val="20"/>
                 <w:szCs w:val="20"/>
               </w:rPr>
-              <w:t>Sección 4.4.5, p. 52: resumen del tratamiento del retardo.</w:t>
-            </w:r>
-          </w:p>
-          <w:p>
-            <w:pPr>
-              <w:spacing w:after="60" w:line="245" w:lineRule="auto"/>
-            </w:pPr>
-            <w:r>
-              <w:rPr>
-                <w:sz w:val="20"/>
-                <w:szCs w:val="20"/>
-              </w:rPr>
-              <w:t>Trabajo futuro, punto 12, p. 83: medición con datos más frecuentes.</w:t>
-            </w:r>
-          </w:p>
-          <w:p>
-            <w:pPr>
-              <w:spacing w:after="60" w:line="245" w:lineRule="auto"/>
-            </w:pPr>
-            <w:r>
-              <w:rPr>
-                <w:sz w:val="20"/>
-                <w:szCs w:val="20"/>
-              </w:rPr>
-              <w:t>Anexo 4.6, p. 114 y 115: por qué se conserva el modelo con retardo.</w:t>
-            </w:r>
-          </w:p>
-          <w:p>
-            <w:pPr>
-              <w:spacing w:line="245" w:lineRule="auto"/>
-            </w:pPr>
-            <w:r>
-              <w:rPr>
-                <w:sz w:val="20"/>
-                <w:szCs w:val="20"/>
-              </w:rPr>
-              <w:t>Anexo 4.12, p. 120 y 121: estabilidad con y sin retardo.</w:t>
+              <w:t xml:space="preserve">Sección 4.4.5, p. 53: resumen del tratamiento del retardo.</w:t>
+            </w:r>
+          </w:p>
+          <w:p>
+            <w:pPr>
+              <w:spacing w:after="60" w:line="245" w:lineRule="auto"/>
+            </w:pPr>
+            <w:r>
+              <w:rPr>
+                <w:sz w:val="20"/>
+                <w:szCs w:val="20"/>
+              </w:rPr>
+              <w:t xml:space="preserve">Trabajo futuro, punto 12, p. 85: medición con datos más frecuentes.</w:t>
+            </w:r>
+          </w:p>
+          <w:p>
+            <w:pPr>
+              <w:spacing w:after="60" w:line="245" w:lineRule="auto"/>
+            </w:pPr>
+            <w:r>
+              <w:rPr>
+                <w:sz w:val="20"/>
+                <w:szCs w:val="20"/>
+              </w:rPr>
+              <w:t xml:space="preserve">Anexo 4.6, p. 118 y 119: por qué se conserva el modelo con retardo.</w:t>
+            </w:r>
+          </w:p>
+          <w:p>
+            <w:pPr>
+              <w:spacing w:after="60" w:line="245" w:lineRule="auto"/>
+            </w:pPr>
+            <w:r>
+              <w:rPr>
+                <w:sz w:val="20"/>
+                <w:szCs w:val="20"/>
+              </w:rPr>
+              <w:t xml:space="preserve">Anexo 4.12, p. 124 y 125: estabilidad con y sin retardo.</w:t>
             </w:r>
           </w:p>
         </w:tc>
@@ -984,16 +939,15 @@
                 <w:sz w:val="20"/>
                 <w:szCs w:val="20"/>
               </w:rPr>
-              <w:t xml:space="preserve">La tesis reconoce que las tres causas influyen. El modelo no representa las potencias bajas con que el motor todavía no gira ni el cálculo con números enteros del Arduino, la función objetivo evalúa un solo cambio de velocidad y el programa entrega una ganancia sin recortarla a su límite. Aun así, el PSO da un punto de partida estable, con más margen de seguridad que las ganancias finales y que las del </w:t>
+              <w:t xml:space="preserve">El objetivo del trabajo es la navegación y la exploración autónoma, y el objetivo específico 2 compromete un controlador PID en lazo cerrado, no la optimización de sus ganancias. El PSO es solo un complemento que entrega un punto de partida, como en otros trabajos que lo usan para sintonizar un PID en robótica móvil (Gökçe et al., 2021). La tesis reconoce que las tres causas influyen. El modelo no representa las potencias bajas con que el motor todavía no gira ni el cálculo con números enteros del Arduino, la función objetivo evalúa un solo cambio de velocidad y el programa entrega una ganancia sin recortarla a su límite. Aun así, el PSO da un punto de partida estable, con más margen de seguridad que las ganancias finales y que las del </w:t>
             </w:r>
             <w:r>
               <w:rPr>
                 <w:i/>
-                <w:iCs/>
-                <w:sz w:val="20"/>
-                <w:szCs w:val="20"/>
-              </w:rPr>
-              <w:t>firmware</w:t>
+                <w:sz w:val="20"/>
+                <w:szCs w:val="20"/>
+              </w:rPr>
+              <w:t xml:space="preserve">firmware</w:t>
             </w:r>
             <w:r>
               <w:rPr>
@@ -1023,31 +977,70 @@
                 <w:sz w:val="20"/>
                 <w:szCs w:val="20"/>
               </w:rPr>
-              <w:t>Sección 4.4.5, p. 52 y 53: razón de cada ajuste hecho a mano.</w:t>
-            </w:r>
-          </w:p>
-          <w:p>
-            <w:pPr>
-              <w:spacing w:after="60" w:line="245" w:lineRule="auto"/>
-            </w:pPr>
-            <w:r>
-              <w:rPr>
-                <w:sz w:val="20"/>
-                <w:szCs w:val="20"/>
-              </w:rPr>
-              <w:t>Sección 5.2, p. 68 y 69: causas del ajuste y aporte del PSO.</w:t>
-            </w:r>
-          </w:p>
-          <w:p>
-            <w:pPr>
-              <w:spacing w:line="245" w:lineRule="auto"/>
-            </w:pPr>
-            <w:r>
-              <w:rPr>
-                <w:sz w:val="20"/>
-                <w:szCs w:val="20"/>
-              </w:rPr>
-              <w:t>Anexo 4.10, p. 119: análisis detallado del aporte del PSO.</w:t>
+              <w:t xml:space="preserve">Introducción, p. 2: PSO como herramienta de apoyo.</w:t>
+            </w:r>
+          </w:p>
+          <w:p>
+            <w:pPr>
+              <w:spacing w:after="60" w:line="245" w:lineRule="auto"/>
+            </w:pPr>
+            <w:r>
+              <w:rPr>
+                <w:sz w:val="20"/>
+                <w:szCs w:val="20"/>
+              </w:rPr>
+              <w:t xml:space="preserve">Sección 4.4.5, p. 53 y 54: razón de cada ajuste hecho a mano.</w:t>
+            </w:r>
+          </w:p>
+          <w:p>
+            <w:pPr>
+              <w:spacing w:after="60" w:line="245" w:lineRule="auto"/>
+            </w:pPr>
+            <w:r>
+              <w:rPr>
+                <w:sz w:val="20"/>
+                <w:szCs w:val="20"/>
+              </w:rPr>
+              <w:t xml:space="preserve">Sección 5.2, p. 69 y 70: objetivo del trabajo, causas del ajuste y aporte del PSO.</w:t>
+            </w:r>
+          </w:p>
+          <w:p>
+            <w:pPr>
+              <w:spacing w:after="60" w:line="245" w:lineRule="auto"/>
+            </w:pPr>
+            <w:r>
+              <w:rPr>
+                <w:sz w:val="20"/>
+                <w:szCs w:val="20"/>
+              </w:rPr>
+              <w:t xml:space="preserve">Anexo 4.10, p. 122: ganancias que entrega el PSO.</w:t>
+            </w:r>
+          </w:p>
+          <w:p>
+            <w:pPr>
+              <w:spacing w:after="60" w:line="245" w:lineRule="auto"/>
+            </w:pPr>
+            <w:r>
+              <w:rPr>
+                <w:sz w:val="20"/>
+                <w:szCs w:val="20"/>
+              </w:rPr>
+              <w:t xml:space="preserve">Anexo 4.12, p. 126 y 127: márgenes del PSO frente a las ganancias finales y las del </w:t>
+            </w:r>
+            <w:r>
+              <w:rPr>
+                <w:i/>
+                <w:sz w:val="20"/>
+                <w:szCs w:val="20"/>
+              </w:rPr>
+              <w:t xml:space="preserve">firmware</w:t>
+            </w:r>
+            <w:r>
+              <w:rPr>
+                <w:sz w:val="20"/>
+                <w:szCs w:val="20"/>
+              </w:rPr>
+              <w:t xml:space="preserve"> original.</w:t>
             </w:r>
           </w:p>
         </w:tc>
@@ -1155,7 +1148,7 @@
                 <w:sz w:val="20"/>
                 <w:szCs w:val="20"/>
               </w:rPr>
-              <w:t>La tesis aclara que el objetivo general compromete la navegación hacia las metas que genera la exploración. Las metas fijas quedan fuera del alcance, porque requieren un mapa guardado y marcas medidas en el recinto, y por eso el objetivo específico 3 se declara cumplido parcialmente. Lo que sí se mide es que, en las cinco exploraciones válidas, el robot navega 21.9 metros durante 12.7 minutos sin intervención manual y sin que se identifiquen fallas del sistema de navegación. El protocolo para metas fijas queda como trabajo futuro.</w:t>
+              <w:t xml:space="preserve">La tesis aclara que el objetivo general compromete la navegación hacia las metas que genera la exploración. Las metas fijas quedan fuera del alcance, porque requieren metas definidas, marcas medidas en el recinto y un registro independiente de la posición final, y por eso el objetivo específico 3 se declara cumplido parcialmente. Lo que sí se mide es que, en las cinco exploraciones válidas, el robot navega 21.9 metros durante 12.7 minutos sin intervención manual. El registro no permite separar los fallos propios de la navegación, por eso no se informa una tasa de éxito. El protocolo para metas fijas queda como trabajo futuro.</w:t>
             </w:r>
           </w:p>
         </w:tc>
@@ -1178,43 +1171,43 @@
                 <w:sz w:val="20"/>
                 <w:szCs w:val="20"/>
               </w:rPr>
-              <w:t>Alcances y limitaciones, p. 3: metas fijas fuera del alcance.</w:t>
-            </w:r>
-          </w:p>
-          <w:p>
-            <w:pPr>
-              <w:spacing w:after="60" w:line="245" w:lineRule="auto"/>
-            </w:pPr>
-            <w:r>
-              <w:rPr>
-                <w:sz w:val="20"/>
-                <w:szCs w:val="20"/>
-              </w:rPr>
-              <w:t>Sección 5.4, p. 73 y 74: lo que sí se mide de la navegación.</w:t>
-            </w:r>
-          </w:p>
-          <w:p>
-            <w:pPr>
-              <w:spacing w:after="60" w:line="245" w:lineRule="auto"/>
-            </w:pPr>
-            <w:r>
-              <w:rPr>
-                <w:sz w:val="20"/>
-                <w:szCs w:val="20"/>
-              </w:rPr>
-              <w:t>Conclusiones, p. 80: objetivo específico 3 cumplido parcialmente.</w:t>
-            </w:r>
-          </w:p>
-          <w:p>
-            <w:pPr>
-              <w:spacing w:line="245" w:lineRule="auto"/>
-            </w:pPr>
-            <w:r>
-              <w:rPr>
-                <w:sz w:val="20"/>
-                <w:szCs w:val="20"/>
-              </w:rPr>
-              <w:t>Anexo 8.3, p. 133: protocolo propuesto para metas fijas.</w:t>
+              <w:t xml:space="preserve">Alcances y limitaciones, p. 3: metas fijas fuera del alcance.</w:t>
+            </w:r>
+          </w:p>
+          <w:p>
+            <w:pPr>
+              <w:spacing w:after="60" w:line="245" w:lineRule="auto"/>
+            </w:pPr>
+            <w:r>
+              <w:rPr>
+                <w:sz w:val="20"/>
+                <w:szCs w:val="20"/>
+              </w:rPr>
+              <w:t xml:space="preserve">Sección 5.4, p. 74 y 75: lo que sí se mide de la navegación.</w:t>
+            </w:r>
+          </w:p>
+          <w:p>
+            <w:pPr>
+              <w:spacing w:after="60" w:line="245" w:lineRule="auto"/>
+            </w:pPr>
+            <w:r>
+              <w:rPr>
+                <w:sz w:val="20"/>
+                <w:szCs w:val="20"/>
+              </w:rPr>
+              <w:t xml:space="preserve">Conclusiones, p. 81: objetivo específico 3 cumplido parcialmente.</w:t>
+            </w:r>
+          </w:p>
+          <w:p>
+            <w:pPr>
+              <w:spacing w:after="60" w:line="245" w:lineRule="auto"/>
+            </w:pPr>
+            <w:r>
+              <w:rPr>
+                <w:sz w:val="20"/>
+                <w:szCs w:val="20"/>
+              </w:rPr>
+              <w:t xml:space="preserve">Anexo 8.3, p. 138: protocolo propuesto para metas fijas.</w:t>
             </w:r>
           </w:p>
         </w:tc>
@@ -1289,7 +1282,7 @@
                 <w:sz w:val="20"/>
                 <w:szCs w:val="20"/>
               </w:rPr>
-              <w:t>La tesis declara este límite y agrega un análisis estadístico. Para cada resultado se calcula un intervalo de confianza al 95 por ciento, que es el rango en que, con ese nivel de confianza, se encuentra el valor real. Algunos resultados quedan con un rango estrecho aun con cinco repeticiones y otros con un rango amplio, por eso se presentan como una verificación en el recinto ensayado y no como valores generales. También se calcula cuántas repeticiones harían falta para precisarlos.</w:t>
+              <w:t xml:space="preserve">La observación es correcta y la tesis la reconoce. El número de ensayos es bajo y ampliarlo se declara como trabajo futuro. Con seis exploraciones, la prueba estadística entrega p = 0.109, mayor que 0.05, por lo que no permite afirmar que la tasa de éxito supere el 50 por ciento (Devore et al., 2021, Cap. 9). Por eso los resultados se presentan como una verificación en el recinto ensayado y no como valores generales. Para cada resultado se calcula un intervalo de confianza al 95 por ciento, que es el rango en que, con ese nivel de confianza, se encuentra el valor real. Algunos quedan con un rango estrecho aun con cinco repeticiones y otros con un rango amplio. Se considera admisible un mínimo de 6 a 10 repeticiones por ensayo para obtener intervalos de confianza con una varianza admisible, criterio coherente con la guía Eurachem (Cantwell, 2025, Sec. 5.3.2).</w:t>
             </w:r>
           </w:p>
         </w:tc>
@@ -1312,31 +1305,43 @@
                 <w:sz w:val="20"/>
                 <w:szCs w:val="20"/>
               </w:rPr>
-              <w:t>Alcances y limitaciones, p. 3: declaración del límite.</w:t>
-            </w:r>
-          </w:p>
-          <w:p>
-            <w:pPr>
-              <w:spacing w:after="60" w:line="245" w:lineRule="auto"/>
-            </w:pPr>
-            <w:r>
-              <w:rPr>
-                <w:sz w:val="20"/>
-                <w:szCs w:val="20"/>
-              </w:rPr>
-              <w:t>Sección 5.6, p. 76 y 77: resumen del análisis estadístico.</w:t>
-            </w:r>
-          </w:p>
-          <w:p>
-            <w:pPr>
-              <w:spacing w:line="245" w:lineRule="auto"/>
-            </w:pPr>
-            <w:r>
-              <w:rPr>
-                <w:sz w:val="20"/>
-                <w:szCs w:val="20"/>
-              </w:rPr>
-              <w:t>Anexo 8.6 y Tabla A8.3, p. 137 y 138: intervalos y repeticiones necesarias.</w:t>
+              <w:t xml:space="preserve">Alcances y limitaciones, p. 3: declaración del límite.</w:t>
+            </w:r>
+          </w:p>
+          <w:p>
+            <w:pPr>
+              <w:spacing w:after="60" w:line="245" w:lineRule="auto"/>
+            </w:pPr>
+            <w:r>
+              <w:rPr>
+                <w:sz w:val="20"/>
+                <w:szCs w:val="20"/>
+              </w:rPr>
+              <w:t xml:space="preserve">Sección 5.6, p. 77 y 78: prueba estadística, intervalos y mínimo de repeticiones.</w:t>
+            </w:r>
+          </w:p>
+          <w:p>
+            <w:pPr>
+              <w:spacing w:after="60" w:line="245" w:lineRule="auto"/>
+            </w:pPr>
+            <w:r>
+              <w:rPr>
+                <w:sz w:val="20"/>
+                <w:szCs w:val="20"/>
+              </w:rPr>
+              <w:t xml:space="preserve">Trabajo futuro, punto 11, p. 85: alcanzar ese mínimo.</w:t>
+            </w:r>
+          </w:p>
+          <w:p>
+            <w:pPr>
+              <w:spacing w:after="60" w:line="245" w:lineRule="auto"/>
+            </w:pPr>
+            <w:r>
+              <w:rPr>
+                <w:sz w:val="20"/>
+                <w:szCs w:val="20"/>
+              </w:rPr>
+              <w:t xml:space="preserve">Anexo 8.6 y Tabla A8.4, p. 142 a 144: intervalos y repeticiones necesarias.</w:t>
             </w:r>
           </w:p>
         </w:tc>
@@ -1435,43 +1440,43 @@
                 <w:sz w:val="20"/>
                 <w:szCs w:val="20"/>
               </w:rPr>
-              <w:t>Sección 5.3, p. 71: resumen de la comparación con el plano.</w:t>
-            </w:r>
-          </w:p>
-          <w:p>
-            <w:pPr>
-              <w:spacing w:after="60" w:line="245" w:lineRule="auto"/>
-            </w:pPr>
-            <w:r>
-              <w:rPr>
-                <w:sz w:val="20"/>
-                <w:szCs w:val="20"/>
-              </w:rPr>
-              <w:t>Limitaciones, p. 81: alcance de la medición a mano.</w:t>
-            </w:r>
-          </w:p>
-          <w:p>
-            <w:pPr>
-              <w:spacing w:after="60" w:line="245" w:lineRule="auto"/>
-            </w:pPr>
-            <w:r>
-              <w:rPr>
-                <w:sz w:val="20"/>
-                <w:szCs w:val="20"/>
-              </w:rPr>
-              <w:t>Trabajo futuro, punto 10, p. 83: nueva medición más precisa.</w:t>
-            </w:r>
-          </w:p>
-          <w:p>
-            <w:pPr>
-              <w:spacing w:line="245" w:lineRule="auto"/>
-            </w:pPr>
-            <w:r>
-              <w:rPr>
-                <w:sz w:val="20"/>
-                <w:szCs w:val="20"/>
-              </w:rPr>
-              <w:t>Anexo 8.5, p. 134 a 137: plano, método y resultados.</w:t>
+              <w:t xml:space="preserve">Sección 5.3, p. 72: resumen de la comparación con el plano.</w:t>
+            </w:r>
+          </w:p>
+          <w:p>
+            <w:pPr>
+              <w:spacing w:after="60" w:line="245" w:lineRule="auto"/>
+            </w:pPr>
+            <w:r>
+              <w:rPr>
+                <w:sz w:val="20"/>
+                <w:szCs w:val="20"/>
+              </w:rPr>
+              <w:t xml:space="preserve">Limitaciones, p. 82: alcance de la medición a mano.</w:t>
+            </w:r>
+          </w:p>
+          <w:p>
+            <w:pPr>
+              <w:spacing w:after="60" w:line="245" w:lineRule="auto"/>
+            </w:pPr>
+            <w:r>
+              <w:rPr>
+                <w:sz w:val="20"/>
+                <w:szCs w:val="20"/>
+              </w:rPr>
+              <w:t xml:space="preserve">Trabajo futuro, punto 10, p. 85: nueva medición más precisa.</w:t>
+            </w:r>
+          </w:p>
+          <w:p>
+            <w:pPr>
+              <w:spacing w:after="60" w:line="245" w:lineRule="auto"/>
+            </w:pPr>
+            <w:r>
+              <w:rPr>
+                <w:sz w:val="20"/>
+                <w:szCs w:val="20"/>
+              </w:rPr>
+              <w:t xml:space="preserve">Anexo 8.5, p. 139 a 142: plano, método y resultados.</w:t>
             </w:r>
           </w:p>
         </w:tc>

</xml_diff>

<commit_message>
mejoras cuadro de observacxiones
</commit_message>
<xml_diff>
--- a/Cuadro_observaciones_comision.docx
+++ b/Cuadro_observaciones_comision.docx
@@ -428,6 +428,7 @@
                 <w:sz w:val="20"/>
                 <w:szCs w:val="20"/>
               </w:rPr>
+              <w:lastRenderedPageBreak/>
               <w:t>2</w:t>
             </w:r>
           </w:p>
@@ -554,7 +555,6 @@
                 <w:sz w:val="20"/>
                 <w:szCs w:val="20"/>
               </w:rPr>
-              <w:lastRenderedPageBreak/>
               <w:t>3</w:t>
             </w:r>
           </w:p>
@@ -601,7 +601,14 @@
                 <w:sz w:val="20"/>
                 <w:szCs w:val="20"/>
               </w:rPr>
-              <w:t>El PI incremental no es una ley nueva. Es una forma clásica del PI, descrita por Åström y Hägglund (2006/2009, Sec. 13.4), la misma fuente de las filas 1 y 2, que la obtiene del PI clásico al calcular en cada ciclo cuánto cambia la potencia y sumar esos cambios. Por eso, sin saturación, es el mismo PI escrito de otra manera, como también muestran Wittenmark et al. (2002, Sec. 8), y su estabilidad es la de un PI clásico con las mismas ganancias, adecuado para procesos de primer orden como el modelo de cada rueda (Åström y Hägglund, 2006/2009, Sec. 3.6). Como verificación complementaria, la tesis analiza la estabilidad con el modelo de cada rueda en dos escenarios de retardo, cero y una décima de segundo (fila 5). En ambos el control es estable, y su sensibilidad máxima, un número que resume cuánto tolera que el motor real difiera del modelo, queda dentro de los valores típicos de 1.2 a 2.0 (Wittenmark et al., 2002, Sec. 5). Según el modelo, solo dejaría de ser estable con un retardo total de unas cuatro décimas de segundo. En 625 variantes del motor, todas son estables sin retardo, y con una décima de segundo solo se pierde la estabilidad si el motor entregara, por cada nivel de potencia, más de 4.4 veces la velocidad que indica el modelo, o 2.8 veces en el peor caso de la rueda izquierda. El análisis es lineal y no incluye la saturación ni los cálculos con números enteros del Arduino.</w:t>
+              <w:t>S</w:t>
+            </w:r>
+            <w:r>
+              <w:rPr>
+                <w:sz w:val="20"/>
+                <w:szCs w:val="20"/>
+              </w:rPr>
+              <w:t>u estabilidad es la de un PI clásico con las mismas ganancias, adecuado para procesos de primer orden como el modelo de cada rueda (Åström y Hägglund, 2006/2009, Sec. 3.6). Como verificación complementaria, la tesis analiza la estabilidad con el modelo de cada rueda en dos escenarios de retardo, cero y una décima de segundo (fila 5). En ambos el control es estable, y su sensibilidad máxima, un número que resume cuánto tolera que el motor real difiera del modelo, queda dentro de los valores típicos de 1.2 a 2.0 (Wittenmark et al., 2002, Sec. 5). Según el modelo, solo dejaría de ser estable con un retardo total de unas cuatro décimas de segundo. En 625 variantes del motor, todas son estables sin retardo, y con una décima de segundo solo se pierde la estabilidad si el motor entregara, por cada nivel de potencia, más de 4.4 veces la velocidad que indica el modelo, o 2.8 veces en el peor caso de la rueda izquierda. El análisis es lineal y no incluye la saturación ni los cálculos con números enteros del Arduino.</w:t>
             </w:r>
           </w:p>
         </w:tc>
@@ -665,6 +672,7 @@
                 <w:sz w:val="20"/>
                 <w:szCs w:val="20"/>
               </w:rPr>
+              <w:lastRenderedPageBreak/>
               <w:t>4</w:t>
             </w:r>
           </w:p>
@@ -711,7 +719,7 @@
                 <w:sz w:val="20"/>
                 <w:szCs w:val="20"/>
               </w:rPr>
-              <w:t>Se agradece la observación. Este trabajo no compara el desempeño de distintos controladores, porque eso no forma parte de sus objetivos. Lo que verifica es que la ley usada cumple su función en las condiciones en que opera el robot, como se espera de un PI aplicado a un proceso de primer orden (Åström y Hägglund, 2006/2009, Sec. 3.6). Según el modelo, a su velocidad máxima cada rueda necesita cerca de 180 de los 255 niveles de potencia (PWM), así que el motor trabaja con margen. En el ensayo, hecho a 0.13 metros por segundo, el límite de velocidad lineal del robot, se miden el error final, el tiempo de subida y el sobreimpulso, indicadores que también usan Gökçe et al. (2021). Ambas ruedas alcanzan la velocidad pedida sin sobrepasarla de forma apreciable y con un error casi nulo. La comparación con otras leyes y las velocidades bajas, como al girar sobre su propio eje, quedan como trabajo futuro.</w:t>
+              <w:t>Este trabajo no compara el desempeño de distintos controladores, porque eso no forma parte de sus objetivos. Lo que verifica es que la ley usada cumple su función en las condiciones en que opera el robot, como se espera de un PI aplicado a un proceso de primer orden (Åström y Hägglund, 2006/2009, Sec. 3.6). Según el modelo, a su velocidad máxima cada rueda necesita cerca de 180 de los 255 niveles de potencia (PWM), así que el motor trabaja con margen. En el ensayo, hecho a 0.13 metros por segundo, el límite de velocidad lineal del robot, se miden el error final, el tiempo de subida y el sobreimpulso, indicadores que también usan Gökçe et al. (2021). Ambas ruedas alcanzan la velocidad pedida sin sobrepasarla de forma apreciable y con un error casi nulo. La comparación con otras leyes y las velocidades bajas, como al girar sobre su propio eje, quedan como trabajo futuro.</w:t>
             </w:r>
           </w:p>
         </w:tc>
@@ -992,7 +1000,7 @@
                 <w:sz w:val="20"/>
                 <w:szCs w:val="20"/>
               </w:rPr>
-              <w:t xml:space="preserve">El objetivo del trabajo es un robot de bajo costo capaz de construir un mapa y navegar de forma autónoma hacia los destinos que genera la exploración. En el control de bajo nivel, el objetivo específico 2 pide un controlador PID en lazo cerrado sobre la velocidad de las ruedas, no optimizar sus ganancias. Por eso el PSO es solo un apoyo para obtener un punto de partida. La tesis reconoce que las tres causas influyen. El modelo no representa las potencias bajas con que el motor todavía no gira ni el cálculo con números enteros del Arduino, la función objetivo evalúa un solo cambio de velocidad y el programa entrega una ganancia sin recortarla a su límite. Aun así, el PSO da un punto de partida estable, con más margen que las ganancias finales y que las del </w:t>
+              <w:t xml:space="preserve">En el control de bajo nivel, el objetivo específico 2 pide un controlador PID en lazo cerrado sobre la velocidad de las ruedas, no optimizar sus ganancias. Por eso el PSO es solo un apoyo para obtener un punto de partida. La tesis reconoce que las tres causas influyen. El modelo no representa las potencias bajas con que el motor todavía no gira ni el cálculo con números enteros del Arduino, la función objetivo evalúa un solo cambio de velocidad y el programa entrega una ganancia sin recortarla a su límite. Aun así, el PSO da un punto de partida estable, con más margen que las ganancias finales y que las del </w:t>
             </w:r>
             <w:r>
               <w:rPr>
@@ -1287,6 +1295,7 @@
                 <w:sz w:val="20"/>
                 <w:szCs w:val="20"/>
               </w:rPr>
+              <w:lastRenderedPageBreak/>
               <w:t>8</w:t>
             </w:r>
           </w:p>
@@ -1421,7 +1430,6 @@
                 <w:sz w:val="20"/>
                 <w:szCs w:val="20"/>
               </w:rPr>
-              <w:lastRenderedPageBreak/>
               <w:t>9</w:t>
             </w:r>
           </w:p>
@@ -1752,6 +1760,7 @@
                 <w:sz w:val="20"/>
                 <w:szCs w:val="20"/>
               </w:rPr>
+              <w:lastRenderedPageBreak/>
               <w:t>12</w:t>
             </w:r>
           </w:p>
@@ -1957,13 +1966,24 @@
       <w:pPr>
         <w:spacing w:after="80" w:line="245" w:lineRule="auto"/>
         <w:ind w:left="567" w:hanging="567"/>
+        <w:rPr>
+          <w:lang w:val="en-US"/>
+        </w:rPr>
       </w:pPr>
       <w:r>
         <w:rPr>
           <w:sz w:val="20"/>
           <w:szCs w:val="20"/>
         </w:rPr>
-        <w:t xml:space="preserve">Bitriá, R., y Palacín, J. (2022). Optimal PID Control of a Brushed DC Motor with an Embedded Low-Cost Magnetic Quadrature Encoder for Improved Step Overshoot and Undershoot Responses in a Mobile Robot Application. </w:t>
+        <w:t xml:space="preserve">Bitriá, R., y Palacín, J. (2022). </w:t>
+      </w:r>
+      <w:r>
+        <w:rPr>
+          <w:sz w:val="20"/>
+          <w:szCs w:val="20"/>
+          <w:lang w:val="en-US"/>
+        </w:rPr>
+        <w:t xml:space="preserve">Optimal PID Control of a Brushed DC Motor with an Embedded Low-Cost Magnetic Quadrature Encoder for Improved Step Overshoot and Undershoot Responses in a Mobile Robot Application. </w:t>
       </w:r>
       <w:r>
         <w:rPr>
@@ -1971,6 +1991,7 @@
           <w:iCs/>
           <w:sz w:val="20"/>
           <w:szCs w:val="20"/>
+          <w:lang w:val="en-US"/>
         </w:rPr>
         <w:t>Sensors</w:t>
       </w:r>
@@ -1978,6 +1999,7 @@
         <w:rPr>
           <w:sz w:val="20"/>
           <w:szCs w:val="20"/>
+          <w:lang w:val="en-US"/>
         </w:rPr>
         <w:t xml:space="preserve">, </w:t>
       </w:r>
@@ -1987,6 +2009,7 @@
           <w:iCs/>
           <w:sz w:val="20"/>
           <w:szCs w:val="20"/>
+          <w:lang w:val="en-US"/>
         </w:rPr>
         <w:t>22</w:t>
       </w:r>
@@ -1994,8 +2017,208 @@
         <w:rPr>
           <w:sz w:val="20"/>
           <w:szCs w:val="20"/>
+          <w:lang w:val="en-US"/>
         </w:rPr>
         <w:t>(20), 7817. https://doi.org/10.3390/s22207817</w:t>
+      </w:r>
+    </w:p>
+    <w:p>
+      <w:pPr>
+        <w:spacing w:after="80" w:line="245" w:lineRule="auto"/>
+        <w:ind w:left="567" w:hanging="567"/>
+        <w:rPr>
+          <w:lang w:val="en-US"/>
+        </w:rPr>
+      </w:pPr>
+      <w:r>
+        <w:rPr>
+          <w:sz w:val="20"/>
+          <w:szCs w:val="20"/>
+          <w:lang w:val="en-US"/>
+        </w:rPr>
+        <w:t xml:space="preserve">Cantwell, H. (Ed.). (2025). </w:t>
+      </w:r>
+      <w:proofErr w:type="spellStart"/>
+      <w:r>
+        <w:rPr>
+          <w:i/>
+          <w:iCs/>
+          <w:sz w:val="20"/>
+          <w:szCs w:val="20"/>
+          <w:lang w:val="en-US"/>
+        </w:rPr>
+        <w:t>Eurachem</w:t>
+      </w:r>
+      <w:proofErr w:type="spellEnd"/>
+      <w:r>
+        <w:rPr>
+          <w:i/>
+          <w:iCs/>
+          <w:sz w:val="20"/>
+          <w:szCs w:val="20"/>
+          <w:lang w:val="en-US"/>
+        </w:rPr>
+        <w:t xml:space="preserve"> Guide: </w:t>
+      </w:r>
+      <w:proofErr w:type="gramStart"/>
+      <w:r>
+        <w:rPr>
+          <w:i/>
+          <w:iCs/>
+          <w:sz w:val="20"/>
+          <w:szCs w:val="20"/>
+          <w:lang w:val="en-US"/>
+        </w:rPr>
+        <w:t>The Fitness</w:t>
+      </w:r>
+      <w:proofErr w:type="gramEnd"/>
+      <w:r>
+        <w:rPr>
+          <w:i/>
+          <w:iCs/>
+          <w:sz w:val="20"/>
+          <w:szCs w:val="20"/>
+          <w:lang w:val="en-US"/>
+        </w:rPr>
+        <w:t xml:space="preserve"> for Purpose of Analytical Methods. A Laboratory Guide to Method Validation and Related Topics</w:t>
+      </w:r>
+      <w:r>
+        <w:rPr>
+          <w:sz w:val="20"/>
+          <w:szCs w:val="20"/>
+          <w:lang w:val="en-US"/>
+        </w:rPr>
+        <w:t xml:space="preserve"> (3.ª ed.). </w:t>
+      </w:r>
+      <w:proofErr w:type="spellStart"/>
+      <w:r>
+        <w:rPr>
+          <w:sz w:val="20"/>
+          <w:szCs w:val="20"/>
+          <w:lang w:val="en-US"/>
+        </w:rPr>
+        <w:t>Eurachem</w:t>
+      </w:r>
+      <w:proofErr w:type="spellEnd"/>
+      <w:r>
+        <w:rPr>
+          <w:sz w:val="20"/>
+          <w:szCs w:val="20"/>
+          <w:lang w:val="en-US"/>
+        </w:rPr>
+        <w:t>. https://www.eurachem.org/images/stories/Guides/pdf/MV_guide_3rd_ed_V1_EN.pdf</w:t>
+      </w:r>
+    </w:p>
+    <w:p>
+      <w:pPr>
+        <w:spacing w:after="80" w:line="245" w:lineRule="auto"/>
+        <w:ind w:left="567" w:hanging="567"/>
+        <w:rPr>
+          <w:lang w:val="en-US"/>
+        </w:rPr>
+      </w:pPr>
+      <w:r>
+        <w:rPr>
+          <w:sz w:val="20"/>
+          <w:szCs w:val="20"/>
+        </w:rPr>
+        <w:t xml:space="preserve">Casini, M., Garulli, A., Giannitrapani, A., y Vicino, A. (2010). </w:t>
+      </w:r>
+      <w:r>
+        <w:rPr>
+          <w:sz w:val="20"/>
+          <w:szCs w:val="20"/>
+          <w:lang w:val="en-US"/>
+        </w:rPr>
+        <w:t xml:space="preserve">A </w:t>
+      </w:r>
+      <w:proofErr w:type="spellStart"/>
+      <w:r>
+        <w:rPr>
+          <w:sz w:val="20"/>
+          <w:szCs w:val="20"/>
+          <w:lang w:val="en-US"/>
+        </w:rPr>
+        <w:t>Matlab</w:t>
+      </w:r>
+      <w:proofErr w:type="spellEnd"/>
+      <w:r>
+        <w:rPr>
+          <w:sz w:val="20"/>
+          <w:szCs w:val="20"/>
+          <w:lang w:val="en-US"/>
+        </w:rPr>
+        <w:t xml:space="preserve">-Based Remote Lab for Multi-Robot Experiments. </w:t>
+      </w:r>
+      <w:r>
+        <w:rPr>
+          <w:i/>
+          <w:iCs/>
+          <w:sz w:val="20"/>
+          <w:szCs w:val="20"/>
+          <w:lang w:val="en-US"/>
+        </w:rPr>
+        <w:t>IFAC Proceedings Volumes</w:t>
+      </w:r>
+      <w:r>
+        <w:rPr>
+          <w:sz w:val="20"/>
+          <w:szCs w:val="20"/>
+          <w:lang w:val="en-US"/>
+        </w:rPr>
+        <w:t xml:space="preserve">, </w:t>
+      </w:r>
+      <w:r>
+        <w:rPr>
+          <w:i/>
+          <w:iCs/>
+          <w:sz w:val="20"/>
+          <w:szCs w:val="20"/>
+          <w:lang w:val="en-US"/>
+        </w:rPr>
+        <w:t>42</w:t>
+      </w:r>
+      <w:r>
+        <w:rPr>
+          <w:sz w:val="20"/>
+          <w:szCs w:val="20"/>
+          <w:lang w:val="en-US"/>
+        </w:rPr>
+        <w:t>(24), 162 a 167. https://doi.org/10.3182/20091021-3-JP-2009.00031</w:t>
+      </w:r>
+    </w:p>
+    <w:p>
+      <w:pPr>
+        <w:spacing w:after="80" w:line="245" w:lineRule="auto"/>
+        <w:ind w:left="567" w:hanging="567"/>
+        <w:rPr>
+          <w:lang w:val="en-US"/>
+        </w:rPr>
+      </w:pPr>
+      <w:r>
+        <w:rPr>
+          <w:sz w:val="20"/>
+          <w:szCs w:val="20"/>
+        </w:rPr>
+        <w:t xml:space="preserve">Devore, J. L., Berk, K. N., y Carlton, M. A. (2021). </w:t>
+      </w:r>
+      <w:r>
+        <w:rPr>
+          <w:i/>
+          <w:iCs/>
+          <w:sz w:val="20"/>
+          <w:szCs w:val="20"/>
+          <w:lang w:val="en-US"/>
+        </w:rPr>
+        <w:t>Modern Mathematical Statistics with Applications</w:t>
+      </w:r>
+      <w:r>
+        <w:rPr>
+          <w:sz w:val="20"/>
+          <w:szCs w:val="20"/>
+          <w:lang w:val="en-US"/>
+        </w:rPr>
+        <w:t xml:space="preserve"> (3.ª ed.). Springer. https://doi.org/10.1007/978-3-030-55156-8</w:t>
       </w:r>
     </w:p>
     <w:p>
@@ -2007,9 +2230,11 @@
         <w:rPr>
           <w:sz w:val="20"/>
           <w:szCs w:val="20"/>
-        </w:rPr>
-        <w:t xml:space="preserve">Cantwell, H. (Ed.). (2025). </w:t>
-      </w:r>
+          <w:lang w:val="en-US"/>
+        </w:rPr>
+        <w:t xml:space="preserve">Gökçe, B., Koca, Y. B., Aslan, Y., y Gökçe, C. O. (2021). Particle Swarm Optimization-Based Optimal PID Control of an Agricultural Mobile Robot. </w:t>
+      </w:r>
+      <w:proofErr w:type="spellStart"/>
       <w:r>
         <w:rPr>
           <w:i/>
@@ -2017,14 +2242,193 @@
           <w:sz w:val="20"/>
           <w:szCs w:val="20"/>
         </w:rPr>
-        <w:t>Eurachem Guide: The Fitness for Purpose of Analytical Methods. A Laboratory Guide to Method Validation and Related Topics</w:t>
-      </w:r>
-      <w:r>
-        <w:rPr>
-          <w:sz w:val="20"/>
-          <w:szCs w:val="20"/>
-        </w:rPr>
-        <w:t xml:space="preserve"> (3.ª ed.). Eurachem. https://www.eurachem.org/images/stories/Guides/pdf/MV_guide_3rd_ed_V1_EN.pdf</w:t>
+        <w:t>Comptes</w:t>
+      </w:r>
+      <w:proofErr w:type="spellEnd"/>
+      <w:r>
+        <w:rPr>
+          <w:i/>
+          <w:iCs/>
+          <w:sz w:val="20"/>
+          <w:szCs w:val="20"/>
+        </w:rPr>
+        <w:t xml:space="preserve"> </w:t>
+      </w:r>
+      <w:proofErr w:type="spellStart"/>
+      <w:r>
+        <w:rPr>
+          <w:i/>
+          <w:iCs/>
+          <w:sz w:val="20"/>
+          <w:szCs w:val="20"/>
+        </w:rPr>
+        <w:t>rendus</w:t>
+      </w:r>
+      <w:proofErr w:type="spellEnd"/>
+      <w:r>
+        <w:rPr>
+          <w:i/>
+          <w:iCs/>
+          <w:sz w:val="20"/>
+          <w:szCs w:val="20"/>
+        </w:rPr>
+        <w:t xml:space="preserve"> de </w:t>
+      </w:r>
+      <w:proofErr w:type="spellStart"/>
+      <w:r>
+        <w:rPr>
+          <w:i/>
+          <w:iCs/>
+          <w:sz w:val="20"/>
+          <w:szCs w:val="20"/>
+        </w:rPr>
+        <w:t>l’Académie</w:t>
+      </w:r>
+      <w:proofErr w:type="spellEnd"/>
+      <w:r>
+        <w:rPr>
+          <w:i/>
+          <w:iCs/>
+          <w:sz w:val="20"/>
+          <w:szCs w:val="20"/>
+        </w:rPr>
+        <w:t xml:space="preserve"> bulgare des Sciences</w:t>
+      </w:r>
+      <w:r>
+        <w:rPr>
+          <w:sz w:val="20"/>
+          <w:szCs w:val="20"/>
+        </w:rPr>
+        <w:t xml:space="preserve">, </w:t>
+      </w:r>
+      <w:r>
+        <w:rPr>
+          <w:i/>
+          <w:iCs/>
+          <w:sz w:val="20"/>
+          <w:szCs w:val="20"/>
+        </w:rPr>
+        <w:t>74</w:t>
+      </w:r>
+      <w:r>
+        <w:rPr>
+          <w:sz w:val="20"/>
+          <w:szCs w:val="20"/>
+        </w:rPr>
+        <w:t>(4), 568 a 575. https://doi.org/10.7546/CRABS.2021.04.12</w:t>
+      </w:r>
+    </w:p>
+    <w:p>
+      <w:pPr>
+        <w:spacing w:after="80" w:line="245" w:lineRule="auto"/>
+        <w:ind w:left="567" w:hanging="567"/>
+        <w:rPr>
+          <w:lang w:val="en-US"/>
+        </w:rPr>
+      </w:pPr>
+      <w:r>
+        <w:rPr>
+          <w:sz w:val="20"/>
+          <w:szCs w:val="20"/>
+        </w:rPr>
+        <w:t xml:space="preserve">Ma, Y., Meng, F., y Xiong, S. (2024). </w:t>
+      </w:r>
+      <w:r>
+        <w:rPr>
+          <w:sz w:val="20"/>
+          <w:szCs w:val="20"/>
+          <w:lang w:val="en-US"/>
+        </w:rPr>
+        <w:t xml:space="preserve">Design and Implementation of a Two-Wheeled Self-Balancing Car Using a Fuzzy Kalman Filter. </w:t>
+      </w:r>
+      <w:r>
+        <w:rPr>
+          <w:i/>
+          <w:iCs/>
+          <w:sz w:val="20"/>
+          <w:szCs w:val="20"/>
+          <w:lang w:val="en-US"/>
+        </w:rPr>
+        <w:t>Applied Sciences</w:t>
+      </w:r>
+      <w:r>
+        <w:rPr>
+          <w:sz w:val="20"/>
+          <w:szCs w:val="20"/>
+          <w:lang w:val="en-US"/>
+        </w:rPr>
+        <w:t xml:space="preserve">, </w:t>
+      </w:r>
+      <w:r>
+        <w:rPr>
+          <w:i/>
+          <w:iCs/>
+          <w:sz w:val="20"/>
+          <w:szCs w:val="20"/>
+          <w:lang w:val="en-US"/>
+        </w:rPr>
+        <w:t>14</w:t>
+      </w:r>
+      <w:r>
+        <w:rPr>
+          <w:sz w:val="20"/>
+          <w:szCs w:val="20"/>
+          <w:lang w:val="en-US"/>
+        </w:rPr>
+        <w:t>(12), 5296. https://doi.org/10.3390/app14125296</w:t>
+      </w:r>
+    </w:p>
+    <w:p>
+      <w:pPr>
+        <w:spacing w:after="80" w:line="245" w:lineRule="auto"/>
+        <w:ind w:left="567" w:hanging="567"/>
+        <w:rPr>
+          <w:lang w:val="en-US"/>
+        </w:rPr>
+      </w:pPr>
+      <w:r>
+        <w:rPr>
+          <w:sz w:val="20"/>
+          <w:szCs w:val="20"/>
+          <w:lang w:val="en-US"/>
+        </w:rPr>
+        <w:t xml:space="preserve">Maxim, A., y De Keyser, R. (2023). Estimation of First Order Plus Dead Time and Second Order Plus Dead Time models from noisy step response data. </w:t>
+      </w:r>
+      <w:r>
+        <w:rPr>
+          <w:i/>
+          <w:iCs/>
+          <w:sz w:val="20"/>
+          <w:szCs w:val="20"/>
+          <w:lang w:val="en-US"/>
+        </w:rPr>
+        <w:t>Asian Journal of Control</w:t>
+      </w:r>
+      <w:r>
+        <w:rPr>
+          <w:sz w:val="20"/>
+          <w:szCs w:val="20"/>
+          <w:lang w:val="en-US"/>
+        </w:rPr>
+        <w:t xml:space="preserve">, </w:t>
+      </w:r>
+      <w:r>
+        <w:rPr>
+          <w:i/>
+          <w:iCs/>
+          <w:sz w:val="20"/>
+          <w:szCs w:val="20"/>
+          <w:lang w:val="en-US"/>
+        </w:rPr>
+        <w:t>25</w:t>
+      </w:r>
+      <w:r>
+        <w:rPr>
+          <w:sz w:val="20"/>
+          <w:szCs w:val="20"/>
+          <w:lang w:val="en-US"/>
+        </w:rPr>
+        <w:t>(3), 1791 a 1804. https://doi.org/10.1002/asjc.2999</w:t>
       </w:r>
     </w:p>
     <w:p>
@@ -2036,9 +2440,11 @@
         <w:rPr>
           <w:sz w:val="20"/>
           <w:szCs w:val="20"/>
-        </w:rPr>
-        <w:t xml:space="preserve">Casini, M., Garulli, A., Giannitrapani, A., y Vicino, A. (2010). A Matlab-Based Remote Lab for Multi-Robot Experiments. </w:t>
-      </w:r>
+          <w:lang w:val="en-US"/>
+        </w:rPr>
+        <w:t xml:space="preserve">Mori, Y., Yokoyama, S., Yamashita, T., Kawamura, H., y Mori, M. (2024). Development of Assistance Level Adjustment Function for Variable Load on a Forearm-Supported Robotic Walker. </w:t>
+      </w:r>
+      <w:proofErr w:type="spellStart"/>
       <w:r>
         <w:rPr>
           <w:i/>
@@ -2046,8 +2452,9 @@
           <w:sz w:val="20"/>
           <w:szCs w:val="20"/>
         </w:rPr>
-        <w:t>IFAC Proceedings Volumes</w:t>
-      </w:r>
+        <w:t>Sensors</w:t>
+      </w:r>
+      <w:proofErr w:type="spellEnd"/>
       <w:r>
         <w:rPr>
           <w:sz w:val="20"/>
@@ -2062,14 +2469,139 @@
           <w:sz w:val="20"/>
           <w:szCs w:val="20"/>
         </w:rPr>
-        <w:t>42</w:t>
-      </w:r>
-      <w:r>
-        <w:rPr>
-          <w:sz w:val="20"/>
-          <w:szCs w:val="20"/>
-        </w:rPr>
-        <w:t>(24), 162 a 167. https://doi.org/10.3182/20091021-3-JP-2009.00031</w:t>
+        <w:t>24</w:t>
+      </w:r>
+      <w:r>
+        <w:rPr>
+          <w:sz w:val="20"/>
+          <w:szCs w:val="20"/>
+        </w:rPr>
+        <w:t>(19), 6456. https://doi.org/10.3390/s24196456</w:t>
+      </w:r>
+    </w:p>
+    <w:p>
+      <w:pPr>
+        <w:spacing w:after="80" w:line="245" w:lineRule="auto"/>
+        <w:ind w:left="567" w:hanging="567"/>
+        <w:rPr>
+          <w:lang w:val="en-US"/>
+        </w:rPr>
+      </w:pPr>
+      <w:r>
+        <w:rPr>
+          <w:sz w:val="20"/>
+          <w:szCs w:val="20"/>
+        </w:rPr>
+        <w:t xml:space="preserve">Raj, R., y Kos, A. (2024). </w:t>
+      </w:r>
+      <w:r>
+        <w:rPr>
+          <w:sz w:val="20"/>
+          <w:szCs w:val="20"/>
+          <w:lang w:val="en-US"/>
+        </w:rPr>
+        <w:t xml:space="preserve">Discussion on Different Controllers Used for the Navigation of Mobile Robot. </w:t>
+      </w:r>
+      <w:r>
+        <w:rPr>
+          <w:i/>
+          <w:iCs/>
+          <w:sz w:val="20"/>
+          <w:szCs w:val="20"/>
+          <w:lang w:val="en-US"/>
+        </w:rPr>
+        <w:t>International Journal of Electronics and Telecommunications</w:t>
+      </w:r>
+      <w:r>
+        <w:rPr>
+          <w:sz w:val="20"/>
+          <w:szCs w:val="20"/>
+          <w:lang w:val="en-US"/>
+        </w:rPr>
+        <w:t xml:space="preserve">, </w:t>
+      </w:r>
+      <w:r>
+        <w:rPr>
+          <w:i/>
+          <w:iCs/>
+          <w:sz w:val="20"/>
+          <w:szCs w:val="20"/>
+          <w:lang w:val="en-US"/>
+        </w:rPr>
+        <w:t>70</w:t>
+      </w:r>
+      <w:r>
+        <w:rPr>
+          <w:sz w:val="20"/>
+          <w:szCs w:val="20"/>
+          <w:lang w:val="en-US"/>
+        </w:rPr>
+        <w:t>(1), 229 a 239. https://doi.org/10.24425/ijet.2024.149535</w:t>
+      </w:r>
+    </w:p>
+    <w:p>
+      <w:pPr>
+        <w:spacing w:after="80" w:line="245" w:lineRule="auto"/>
+        <w:ind w:left="567" w:hanging="567"/>
+        <w:rPr>
+          <w:lang w:val="en-US"/>
+        </w:rPr>
+      </w:pPr>
+      <w:r>
+        <w:rPr>
+          <w:sz w:val="20"/>
+          <w:szCs w:val="20"/>
+          <w:lang w:val="en-US"/>
+        </w:rPr>
+        <w:t xml:space="preserve">Sundström, E., Hägglund, T., Bauer, M., Eker, J., y Soltesz, K. (2024). Reference Implementation of the PID Controller. </w:t>
+      </w:r>
+      <w:r>
+        <w:rPr>
+          <w:i/>
+          <w:iCs/>
+          <w:sz w:val="20"/>
+          <w:szCs w:val="20"/>
+          <w:lang w:val="en-US"/>
+        </w:rPr>
+        <w:t>IFAC-</w:t>
+      </w:r>
+      <w:proofErr w:type="spellStart"/>
+      <w:r>
+        <w:rPr>
+          <w:i/>
+          <w:iCs/>
+          <w:sz w:val="20"/>
+          <w:szCs w:val="20"/>
+          <w:lang w:val="en-US"/>
+        </w:rPr>
+        <w:t>PapersOnLine</w:t>
+      </w:r>
+      <w:proofErr w:type="spellEnd"/>
+      <w:r>
+        <w:rPr>
+          <w:sz w:val="20"/>
+          <w:szCs w:val="20"/>
+          <w:lang w:val="en-US"/>
+        </w:rPr>
+        <w:t xml:space="preserve">, </w:t>
+      </w:r>
+      <w:r>
+        <w:rPr>
+          <w:i/>
+          <w:iCs/>
+          <w:sz w:val="20"/>
+          <w:szCs w:val="20"/>
+          <w:lang w:val="en-US"/>
+        </w:rPr>
+        <w:t>58</w:t>
+      </w:r>
+      <w:r>
+        <w:rPr>
+          <w:sz w:val="20"/>
+          <w:szCs w:val="20"/>
+          <w:lang w:val="en-US"/>
+        </w:rPr>
+        <w:t>(7), 370 a 375. https://doi.org/10.1016/j.ifacol.2024.08.090</w:t>
       </w:r>
     </w:p>
     <w:p>
@@ -2082,8 +2614,17 @@
           <w:sz w:val="20"/>
           <w:szCs w:val="20"/>
         </w:rPr>
-        <w:t xml:space="preserve">Devore, J. L., Berk, K. N., y Carlton, M. A. (2021). </w:t>
-      </w:r>
+        <w:t xml:space="preserve">Trejos, K., Rincón, L., Bolaños, M., Fallas, J., y Marín, L. (2022). </w:t>
+      </w:r>
+      <w:r>
+        <w:rPr>
+          <w:sz w:val="20"/>
+          <w:szCs w:val="20"/>
+          <w:lang w:val="en-US"/>
+        </w:rPr>
+        <w:t xml:space="preserve">2D SLAM Algorithms Characterization, Calibration, and Comparison Considering Pose Error, Map Accuracy as Well as CPU and Memory Usage. </w:t>
+      </w:r>
+      <w:proofErr w:type="spellStart"/>
       <w:r>
         <w:rPr>
           <w:i/>
@@ -2091,14 +2632,65 @@
           <w:sz w:val="20"/>
           <w:szCs w:val="20"/>
         </w:rPr>
-        <w:t>Modern Mathematical Statistics with Applications</w:t>
-      </w:r>
-      <w:r>
-        <w:rPr>
-          <w:sz w:val="20"/>
-          <w:szCs w:val="20"/>
-        </w:rPr>
-        <w:t xml:space="preserve"> (3.ª ed.). Springer. https://doi.org/10.1007/978-3-030-55156-8</w:t>
+        <w:t>Sensors</w:t>
+      </w:r>
+      <w:proofErr w:type="spellEnd"/>
+      <w:r>
+        <w:rPr>
+          <w:sz w:val="20"/>
+          <w:szCs w:val="20"/>
+        </w:rPr>
+        <w:t xml:space="preserve">, </w:t>
+      </w:r>
+      <w:r>
+        <w:rPr>
+          <w:i/>
+          <w:iCs/>
+          <w:sz w:val="20"/>
+          <w:szCs w:val="20"/>
+        </w:rPr>
+        <w:t>22</w:t>
+      </w:r>
+      <w:r>
+        <w:rPr>
+          <w:sz w:val="20"/>
+          <w:szCs w:val="20"/>
+        </w:rPr>
+        <w:t>(18), 6903. https://doi.org/10.3390/s22186903</w:t>
+      </w:r>
+    </w:p>
+    <w:p>
+      <w:pPr>
+        <w:spacing w:after="80" w:line="245" w:lineRule="auto"/>
+        <w:ind w:left="567" w:hanging="567"/>
+        <w:rPr>
+          <w:lang w:val="en-US"/>
+        </w:rPr>
+      </w:pPr>
+      <w:r>
+        <w:rPr>
+          <w:sz w:val="20"/>
+          <w:szCs w:val="20"/>
+        </w:rPr>
+        <w:t xml:space="preserve">Wittenmark, B., Åström, K. J., y Årzén, K.-E. (2002). </w:t>
+      </w:r>
+      <w:r>
+        <w:rPr>
+          <w:i/>
+          <w:iCs/>
+          <w:sz w:val="20"/>
+          <w:szCs w:val="20"/>
+          <w:lang w:val="en-US"/>
+        </w:rPr>
+        <w:t>Computer Control: An Overview</w:t>
+      </w:r>
+      <w:r>
+        <w:rPr>
+          <w:sz w:val="20"/>
+          <w:szCs w:val="20"/>
+          <w:lang w:val="en-US"/>
+        </w:rPr>
+        <w:t xml:space="preserve"> [IFAC Professional Brief]. International Federation of Automatic Control. https://www.ifac-control.org/publications/list-of-professional-briefs/pb_wittenmark_etal_final.pdf/view</w:t>
       </w:r>
     </w:p>
     <w:p>
@@ -2110,9 +2702,11 @@
         <w:rPr>
           <w:sz w:val="20"/>
           <w:szCs w:val="20"/>
-        </w:rPr>
-        <w:t xml:space="preserve">Gökçe, B., Koca, Y. B., Aslan, Y., y Gökçe, C. O. (2021). Particle Swarm Optimization-Based Optimal PID Control of an Agricultural Mobile Robot. </w:t>
-      </w:r>
+          <w:lang w:val="en-US"/>
+        </w:rPr>
+        <w:t xml:space="preserve">Wu, M., Wang, H., Wang, W., Miao, S., y Hu, S. (2026). A ROS 2-Based Robotic Platform for Mobile Occupant Sensing and Edge Perception in Buildings. </w:t>
+      </w:r>
+      <w:proofErr w:type="spellStart"/>
       <w:r>
         <w:rPr>
           <w:i/>
@@ -2120,352 +2714,9 @@
           <w:sz w:val="20"/>
           <w:szCs w:val="20"/>
         </w:rPr>
-        <w:t>Comptes rendus de l’Académie bulgare des Sciences</w:t>
-      </w:r>
-      <w:r>
-        <w:rPr>
-          <w:sz w:val="20"/>
-          <w:szCs w:val="20"/>
-        </w:rPr>
-        <w:t xml:space="preserve">, </w:t>
-      </w:r>
-      <w:r>
-        <w:rPr>
-          <w:i/>
-          <w:iCs/>
-          <w:sz w:val="20"/>
-          <w:szCs w:val="20"/>
-        </w:rPr>
-        <w:t>74</w:t>
-      </w:r>
-      <w:r>
-        <w:rPr>
-          <w:sz w:val="20"/>
-          <w:szCs w:val="20"/>
-        </w:rPr>
-        <w:t>(4), 568 a 575. https://doi.org/10.7546/CRABS.2021.04.12</w:t>
-      </w:r>
-    </w:p>
-    <w:p>
-      <w:pPr>
-        <w:spacing w:after="80" w:line="245" w:lineRule="auto"/>
-        <w:ind w:left="567" w:hanging="567"/>
-      </w:pPr>
-      <w:r>
-        <w:rPr>
-          <w:sz w:val="20"/>
-          <w:szCs w:val="20"/>
-        </w:rPr>
-        <w:t xml:space="preserve">Ma, Y., Meng, F., y Xiong, S. (2024). Design and Implementation of a Two-Wheeled Self-Balancing Car Using a Fuzzy Kalman Filter. </w:t>
-      </w:r>
-      <w:r>
-        <w:rPr>
-          <w:i/>
-          <w:iCs/>
-          <w:sz w:val="20"/>
-          <w:szCs w:val="20"/>
-        </w:rPr>
-        <w:t>Applied Sciences</w:t>
-      </w:r>
-      <w:r>
-        <w:rPr>
-          <w:sz w:val="20"/>
-          <w:szCs w:val="20"/>
-        </w:rPr>
-        <w:t xml:space="preserve">, </w:t>
-      </w:r>
-      <w:r>
-        <w:rPr>
-          <w:i/>
-          <w:iCs/>
-          <w:sz w:val="20"/>
-          <w:szCs w:val="20"/>
-        </w:rPr>
-        <w:t>14</w:t>
-      </w:r>
-      <w:r>
-        <w:rPr>
-          <w:sz w:val="20"/>
-          <w:szCs w:val="20"/>
-        </w:rPr>
-        <w:t>(12), 5296. https://doi.org/10.3390/app14125296</w:t>
-      </w:r>
-    </w:p>
-    <w:p>
-      <w:pPr>
-        <w:spacing w:after="80" w:line="245" w:lineRule="auto"/>
-        <w:ind w:left="567" w:hanging="567"/>
-      </w:pPr>
-      <w:r>
-        <w:rPr>
-          <w:sz w:val="20"/>
-          <w:szCs w:val="20"/>
-        </w:rPr>
-        <w:t xml:space="preserve">Maxim, A., y De Keyser, R. (2023). Estimation of First Order Plus Dead Time and Second Order Plus Dead Time models from noisy step response data. </w:t>
-      </w:r>
-      <w:r>
-        <w:rPr>
-          <w:i/>
-          <w:iCs/>
-          <w:sz w:val="20"/>
-          <w:szCs w:val="20"/>
-        </w:rPr>
-        <w:t>Asian Journal of Control</w:t>
-      </w:r>
-      <w:r>
-        <w:rPr>
-          <w:sz w:val="20"/>
-          <w:szCs w:val="20"/>
-        </w:rPr>
-        <w:t xml:space="preserve">, </w:t>
-      </w:r>
-      <w:r>
-        <w:rPr>
-          <w:i/>
-          <w:iCs/>
-          <w:sz w:val="20"/>
-          <w:szCs w:val="20"/>
-        </w:rPr>
-        <w:t>25</w:t>
-      </w:r>
-      <w:r>
-        <w:rPr>
-          <w:sz w:val="20"/>
-          <w:szCs w:val="20"/>
-        </w:rPr>
-        <w:t>(3), 1791 a 1804. https://doi.org/10.1002/asjc.2999</w:t>
-      </w:r>
-    </w:p>
-    <w:p>
-      <w:pPr>
-        <w:spacing w:after="80" w:line="245" w:lineRule="auto"/>
-        <w:ind w:left="567" w:hanging="567"/>
-      </w:pPr>
-      <w:r>
-        <w:rPr>
-          <w:sz w:val="20"/>
-          <w:szCs w:val="20"/>
-        </w:rPr>
-        <w:t xml:space="preserve">Mori, Y., Yokoyama, S., Yamashita, T., Kawamura, H., y Mori, M. (2024). Development of Assistance Level Adjustment Function for Variable Load on a Forearm-Supported Robotic Walker. </w:t>
-      </w:r>
-      <w:r>
-        <w:rPr>
-          <w:i/>
-          <w:iCs/>
-          <w:sz w:val="20"/>
-          <w:szCs w:val="20"/>
-        </w:rPr>
-        <w:t>Sensors</w:t>
-      </w:r>
-      <w:r>
-        <w:rPr>
-          <w:sz w:val="20"/>
-          <w:szCs w:val="20"/>
-        </w:rPr>
-        <w:t xml:space="preserve">, </w:t>
-      </w:r>
-      <w:r>
-        <w:rPr>
-          <w:i/>
-          <w:iCs/>
-          <w:sz w:val="20"/>
-          <w:szCs w:val="20"/>
-        </w:rPr>
-        <w:t>24</w:t>
-      </w:r>
-      <w:r>
-        <w:rPr>
-          <w:sz w:val="20"/>
-          <w:szCs w:val="20"/>
-        </w:rPr>
-        <w:t>(19), 6456. https://doi.org/10.3390/s24196456</w:t>
-      </w:r>
-    </w:p>
-    <w:p>
-      <w:pPr>
-        <w:spacing w:after="80" w:line="245" w:lineRule="auto"/>
-        <w:ind w:left="567" w:hanging="567"/>
-      </w:pPr>
-      <w:r>
-        <w:rPr>
-          <w:sz w:val="20"/>
-          <w:szCs w:val="20"/>
-        </w:rPr>
-        <w:t xml:space="preserve">Raj, R., y Kos, A. (2024). Discussion on Different Controllers Used for the Navigation of Mobile Robot. </w:t>
-      </w:r>
-      <w:r>
-        <w:rPr>
-          <w:i/>
-          <w:iCs/>
-          <w:sz w:val="20"/>
-          <w:szCs w:val="20"/>
-        </w:rPr>
-        <w:t>International Journal of Electronics and Telecommunications</w:t>
-      </w:r>
-      <w:r>
-        <w:rPr>
-          <w:sz w:val="20"/>
-          <w:szCs w:val="20"/>
-        </w:rPr>
-        <w:t xml:space="preserve">, </w:t>
-      </w:r>
-      <w:r>
-        <w:rPr>
-          <w:i/>
-          <w:iCs/>
-          <w:sz w:val="20"/>
-          <w:szCs w:val="20"/>
-        </w:rPr>
-        <w:t>70</w:t>
-      </w:r>
-      <w:r>
-        <w:rPr>
-          <w:sz w:val="20"/>
-          <w:szCs w:val="20"/>
-        </w:rPr>
-        <w:t>(1), 229 a 239. https://doi.org/10.24425/ijet.2024.149535</w:t>
-      </w:r>
-    </w:p>
-    <w:p>
-      <w:pPr>
-        <w:spacing w:after="80" w:line="245" w:lineRule="auto"/>
-        <w:ind w:left="567" w:hanging="567"/>
-      </w:pPr>
-      <w:r>
-        <w:rPr>
-          <w:sz w:val="20"/>
-          <w:szCs w:val="20"/>
-        </w:rPr>
-        <w:t xml:space="preserve">Sundström, E., Hägglund, T., Bauer, M., Eker, J., y Soltesz, K. (2024). Reference Implementation of the PID Controller. </w:t>
-      </w:r>
-      <w:r>
-        <w:rPr>
-          <w:i/>
-          <w:iCs/>
-          <w:sz w:val="20"/>
-          <w:szCs w:val="20"/>
-        </w:rPr>
-        <w:t>IFAC-PapersOnLine</w:t>
-      </w:r>
-      <w:r>
-        <w:rPr>
-          <w:sz w:val="20"/>
-          <w:szCs w:val="20"/>
-        </w:rPr>
-        <w:t xml:space="preserve">, </w:t>
-      </w:r>
-      <w:r>
-        <w:rPr>
-          <w:i/>
-          <w:iCs/>
-          <w:sz w:val="20"/>
-          <w:szCs w:val="20"/>
-        </w:rPr>
-        <w:t>58</w:t>
-      </w:r>
-      <w:r>
-        <w:rPr>
-          <w:sz w:val="20"/>
-          <w:szCs w:val="20"/>
-        </w:rPr>
-        <w:t>(7), 370 a 375. https://doi.org/10.1016/j.ifacol.2024.08.090</w:t>
-      </w:r>
-    </w:p>
-    <w:p>
-      <w:pPr>
-        <w:spacing w:after="80" w:line="245" w:lineRule="auto"/>
-        <w:ind w:left="567" w:hanging="567"/>
-      </w:pPr>
-      <w:r>
-        <w:rPr>
-          <w:sz w:val="20"/>
-          <w:szCs w:val="20"/>
-        </w:rPr>
-        <w:t xml:space="preserve">Trejos, K., Rincón, L., Bolaños, M., Fallas, J., y Marín, L. (2022). 2D SLAM Algorithms Characterization, Calibration, and Comparison Considering Pose Error, Map Accuracy as Well as CPU and Memory Usage. </w:t>
-      </w:r>
-      <w:r>
-        <w:rPr>
-          <w:i/>
-          <w:iCs/>
-          <w:sz w:val="20"/>
-          <w:szCs w:val="20"/>
-        </w:rPr>
-        <w:t>Sensors</w:t>
-      </w:r>
-      <w:r>
-        <w:rPr>
-          <w:sz w:val="20"/>
-          <w:szCs w:val="20"/>
-        </w:rPr>
-        <w:t xml:space="preserve">, </w:t>
-      </w:r>
-      <w:r>
-        <w:rPr>
-          <w:i/>
-          <w:iCs/>
-          <w:sz w:val="20"/>
-          <w:szCs w:val="20"/>
-        </w:rPr>
-        <w:t>22</w:t>
-      </w:r>
-      <w:r>
-        <w:rPr>
-          <w:sz w:val="20"/>
-          <w:szCs w:val="20"/>
-        </w:rPr>
-        <w:t>(18), 6903. https://doi.org/10.3390/s22186903</w:t>
-      </w:r>
-    </w:p>
-    <w:p>
-      <w:pPr>
-        <w:spacing w:after="80" w:line="245" w:lineRule="auto"/>
-        <w:ind w:left="567" w:hanging="567"/>
-      </w:pPr>
-      <w:r>
-        <w:rPr>
-          <w:sz w:val="20"/>
-          <w:szCs w:val="20"/>
-        </w:rPr>
-        <w:t xml:space="preserve">Wittenmark, B., Åström, K. J., y Årzén, K.-E. (2002). </w:t>
-      </w:r>
-      <w:r>
-        <w:rPr>
-          <w:i/>
-          <w:iCs/>
-          <w:sz w:val="20"/>
-          <w:szCs w:val="20"/>
-        </w:rPr>
-        <w:t>Computer Control: An Overview</w:t>
-      </w:r>
-      <w:r>
-        <w:rPr>
-          <w:sz w:val="20"/>
-          <w:szCs w:val="20"/>
-        </w:rPr>
-        <w:t xml:space="preserve"> [IFAC Professional Brief]. International Federation of Automatic Control. https://www.ifac-control.org/publications/list-of-professional-briefs/pb_wittenmark_etal_final.pdf/view</w:t>
-      </w:r>
-    </w:p>
-    <w:p>
-      <w:pPr>
-        <w:spacing w:after="80" w:line="245" w:lineRule="auto"/>
-        <w:ind w:left="567" w:hanging="567"/>
-      </w:pPr>
-      <w:r>
-        <w:rPr>
-          <w:sz w:val="20"/>
-          <w:szCs w:val="20"/>
-        </w:rPr>
-        <w:t xml:space="preserve">Wu, M., Wang, H., Wang, W., Miao, S., y Hu, S. (2026). A ROS 2-Based Robotic Platform for Mobile Occupant Sensing and Edge Perception in Buildings. </w:t>
-      </w:r>
-      <w:r>
-        <w:rPr>
-          <w:i/>
-          <w:iCs/>
-          <w:sz w:val="20"/>
-          <w:szCs w:val="20"/>
-        </w:rPr>
         <w:t>Buildings</w:t>
       </w:r>
+      <w:proofErr w:type="spellEnd"/>
       <w:r>
         <w:rPr>
           <w:sz w:val="20"/>

</xml_diff>